<commit_message>
Updated seed template files.
</commit_message>
<xml_diff>
--- a/app/db/seed_data/templates/DEFAULT_UKR_akt_nadanykh_posluh.docx
+++ b/app/db/seed_data/templates/DEFAULT_UKR_akt_nadanykh_posluh.docx
@@ -204,7 +204,7 @@
           <w:szCs w:val="30"/>
           <w:rtl w:val="0"/>
         </w:rPr>
-        <w:t xml:space="preserve">{{ prefix, id, sep=”-” }}</w:t>
+        <w:t xml:space="preserve">{{ prefix, id, sep=”” }}</w:t>
       </w:r>
       <w:r>
         <w:rPr>
@@ -254,7 +254,7 @@
         </w:rPr>
         <w:t xml:space="preserve">Ми, що нижче підписалися, представник Замовника {{ client_type }} {{ client_name }}, з одного боку, і представник Виконавця {{ provider_type }} {{ provider_name }}, з іншого боку, склали цей акт про те, що на підставі наведених документів:</w:t>
         <w:br w:type="textWrapping"/>
-        <w:t xml:space="preserve">        Розр. док.: Рахунок на оплату № {{ prefix, id, sep=”-” }} від {{ date }}</w:t>
+        <w:t xml:space="preserve">        Розр. док.: Рахунок на оплату № {{ prefix, id, sep=”” }} від {{ date }}</w:t>
         <w:br w:type="textWrapping"/>
         <w:t xml:space="preserve">Виконавцем були виконані наступні роботи (надані такі послуги):</w:t>
         <w:br w:type="textWrapping"/>

</xml_diff>